<commit_message>
Guía v2.3: logos del CIFP y de la Junta en la portada
Co-Authored-By: Claude Opus 5.5 <noreply@anthropic.com>
</commit_message>
<xml_diff>
--- a/docs/Guia_Practica_Automatizaciones_CIFP_v2.3.docx
+++ b/docs/Guia_Practica_Automatizaciones_CIFP_v2.3.docx
@@ -2,26 +2,6 @@
 <file path=word/document.xml><?xml version="1.0" encoding="utf-8"?>
 <w:document xmlns:wpc="http://schemas.microsoft.com/office/word/2010/wordprocessingCanvas" xmlns:cx="http://schemas.microsoft.com/office/drawing/2014/chartex" xmlns:cx1="http://schemas.microsoft.com/office/drawing/2015/9/8/chartex" xmlns:cx2="http://schemas.microsoft.com/office/drawing/2015/10/21/chartex" xmlns:cx3="http://schemas.microsoft.com/office/drawing/2016/5/9/chartex" xmlns:cx4="http://schemas.microsoft.com/office/drawing/2016/5/10/chartex" xmlns:cx5="http://schemas.microsoft.com/office/drawing/2016/5/11/chartex" xmlns:cx6="http://schemas.microsoft.com/office/drawing/2016/5/12/chartex" xmlns:cx7="http://schemas.microsoft.com/office/drawing/2016/5/13/chartex" xmlns:cx8="http://schemas.microsoft.com/office/drawing/2016/5/14/chartex" xmlns:mc="http://schemas.openxmlformats.org/markup-compatibility/2006" xmlns:aink="http://schemas.microsoft.com/office/drawing/2016/ink" xmlns:am3d="http://schemas.microsoft.com/office/drawing/2017/model3d" xmlns:o="urn:schemas-microsoft-com:office:office" xmlns:oel="http://schemas.microsoft.com/office/2019/extlst" xmlns:r="http://schemas.openxmlformats.org/officeDocument/2006/relationships" xmlns:m="http://schemas.openxmlformats.org/officeDocument/2006/math" xmlns:v="urn:schemas-microsoft-com:vml" xmlns:wp14="http://schemas.microsoft.com/office/word/2010/wordprocessingDrawing" xmlns:wp="http://schemas.openxmlformats.org/drawingml/2006/wordprocessingDrawing" xmlns:w10="urn:schemas-microsoft-com:office:word" xmlns:w="http://schemas.openxmlformats.org/wordprocessingml/2006/main" xmlns:w14="http://schemas.microsoft.com/office/word/2010/wordml" xmlns:w15="http://schemas.microsoft.com/office/word/2012/wordml" xmlns:w16cex="http://schemas.microsoft.com/office/word/2018/wordml/cex" xmlns:w16cid="http://schemas.microsoft.com/office/word/2016/wordml/cid" xmlns:w16="http://schemas.microsoft.com/office/word/2018/wordml" xmlns:w16du="http://schemas.microsoft.com/office/word/2023/wordml/word16du" xmlns:w16sdtdh="http://schemas.microsoft.com/office/word/2020/wordml/sdtdatahash" xmlns:w16sdtfl="http://schemas.microsoft.com/office/word/2024/wordml/sdtformatlock" xmlns:w16se="http://schemas.microsoft.com/office/word/2015/wordml/symex" xmlns:wpg="http://schemas.microsoft.com/office/word/2010/wordprocessingGroup" xmlns:wpi="http://schemas.microsoft.com/office/word/2010/wordprocessingInk" xmlns:wne="http://schemas.microsoft.com/office/word/2006/wordml" xmlns:wps="http://schemas.microsoft.com/office/word/2010/wordprocessingShape" mc:Ignorable="w14 w15 w16se w16cid w16 w16cex w16sdtdh w16sdtfl w16du wp14">
   <w:body>
-    <w:p>
-      <w:pPr>
-        <w:spacing w:after="120"/>
-      </w:pPr>
-    </w:p>
-    <w:p>
-      <w:pPr>
-        <w:spacing w:after="120"/>
-      </w:pPr>
-    </w:p>
-    <w:p>
-      <w:pPr>
-        <w:spacing w:after="120"/>
-      </w:pPr>
-    </w:p>
-    <w:p>
-      <w:pPr>
-        <w:spacing w:after="120"/>
-      </w:pPr>
-    </w:p>
     <w:p>
       <w:pPr>
         <w:spacing w:after="120"/>
@@ -57,11 +37,6 @@
         </w:rPr>
         <w:t>Proyecto Aula-Empresa+ Castilla y León 2025/2026</w:t>
       </w:r>
-    </w:p>
-    <w:p>
-      <w:pPr>
-        <w:spacing w:after="120"/>
-      </w:pPr>
     </w:p>
     <w:p>
       <w:pPr>
@@ -121,8 +96,80 @@
     </w:p>
     <w:p>
       <w:pPr>
-        <w:spacing w:after="120"/>
-      </w:pPr>
+        <w:spacing w:after="340" w:before="340"/>
+        <w:jc w:val="center"/>
+      </w:pPr>
+      <w:r>
+        <w:drawing>
+          <wp:inline xmlns:a="http://schemas.openxmlformats.org/drawingml/2006/main" xmlns:pic="http://schemas.openxmlformats.org/drawingml/2006/picture">
+            <wp:extent cx="1360174" cy="792000"/>
+            <wp:docPr id="989645" name="Picture 989645"/>
+            <wp:cNvGraphicFramePr>
+              <a:graphicFrameLocks noChangeAspect="1"/>
+            </wp:cNvGraphicFramePr>
+            <a:graphic>
+              <a:graphicData uri="http://schemas.openxmlformats.org/drawingml/2006/picture">
+                <pic:pic>
+                  <pic:nvPicPr>
+                    <pic:cNvPr id="0" name="Logo_CIFP.png"/>
+                    <pic:cNvPicPr/>
+                  </pic:nvPicPr>
+                  <pic:blipFill>
+                    <a:blip r:embed="rId16"/>
+                    <a:stretch>
+                      <a:fillRect/>
+                    </a:stretch>
+                  </pic:blipFill>
+                  <pic:spPr>
+                    <a:xfrm>
+                      <a:off x="0" y="0"/>
+                      <a:ext cx="1360174" cy="792000"/>
+                    </a:xfrm>
+                    <a:prstGeom prst="rect"/>
+                  </pic:spPr>
+                </pic:pic>
+              </a:graphicData>
+            </a:graphic>
+          </wp:inline>
+        </w:drawing>
+      </w:r>
+      <w:r>
+        <w:t xml:space="preserve">   </w:t>
+      </w:r>
+      <w:r>
+        <w:drawing>
+          <wp:inline xmlns:a="http://schemas.openxmlformats.org/drawingml/2006/main" xmlns:pic="http://schemas.openxmlformats.org/drawingml/2006/picture">
+            <wp:extent cx="1343337" cy="792000"/>
+            <wp:docPr id="989646" name="Picture 989646"/>
+            <wp:cNvGraphicFramePr>
+              <a:graphicFrameLocks noChangeAspect="1"/>
+            </wp:cNvGraphicFramePr>
+            <a:graphic>
+              <a:graphicData uri="http://schemas.openxmlformats.org/drawingml/2006/picture">
+                <pic:pic>
+                  <pic:nvPicPr>
+                    <pic:cNvPr id="0" name="junta.png"/>
+                    <pic:cNvPicPr/>
+                  </pic:nvPicPr>
+                  <pic:blipFill>
+                    <a:blip r:embed="rId17"/>
+                    <a:stretch>
+                      <a:fillRect/>
+                    </a:stretch>
+                  </pic:blipFill>
+                  <pic:spPr>
+                    <a:xfrm>
+                      <a:off x="0" y="0"/>
+                      <a:ext cx="1343337" cy="792000"/>
+                    </a:xfrm>
+                    <a:prstGeom prst="rect"/>
+                  </pic:spPr>
+                </pic:pic>
+              </a:graphicData>
+            </a:graphic>
+          </wp:inline>
+        </w:drawing>
+      </w:r>
     </w:p>
     <w:p>
       <w:pPr>

</xml_diff>